<commit_message>
Revise timed technical speaker script
</commit_message>
<xml_diff>
--- a/docs/7分钟技术PPT与3分钟后台演示稿.docx
+++ b/docs/7分钟技术PPT与3分钟后台演示稿.docx
@@ -6978,7 +6978,7 @@
           <w:rFonts w:ascii="Microsoft YaHei" w:hAnsi="Microsoft YaHei" w:eastAsia="Microsoft YaHei"/>
           <w:sz w:val="20"/>
         </w:rPr>
-        <w:t>下面是**限时口播版**，按 6分40秒设计，留 20 秒给换页和停顿。不要再临场扩写；老师追问时再打开后面的参数表补细节。</w:t>
+        <w:t>下面是**限时口播版**。按中文技术汇报约每分钟 230-250 字设计，正文控制在 7 分钟内；每页下面给出估算字数和公网后台指向。正式汇报时只念“口播”，不要把文件路径、代码文件名念出来。</w:t>
       </w:r>
     </w:p>
     <w:p>
@@ -6986,7 +6986,7 @@
         <w:pStyle w:val="Heading2"/>
       </w:pPr>
       <w:r>
-        <w:t>第 1 页，0:00-0:35，系统链路</w:t>
+        <w:t>第 1 页，0:00-0:40，系统链路</w:t>
       </w:r>
     </w:p>
     <w:p>
@@ -7008,16 +7008,25 @@
           <w:i/>
           <w:sz w:val="20"/>
         </w:rPr>
-        <w:t>先说明这套 demo 实际跑了哪些东西。配置里 `seed=42`，生成 `120` 个合成用户，推荐 `top_k=5`，文本向量维度是 `384`。完整 pipeline 是：合成用户 -&gt; 画像抽取 -&gt; 三元组和本体校验 -&gt; MiniLM 向量和 FAISS 检索 -&gt; Neo4j 产品图 -&gt; GraphSAGE/GCN 训练 -&gt; RAG 聊天。最终输出在 `pipeline_summary.json`：`3365` 条画像三元组、`600` 条推荐、Neo4j 产品图 `5209` 个节点、`14600` 条关系。</w:t>
-      </w:r>
-    </w:p>
-    <w:p>
-      <w:r>
-        <w:rPr>
-          <w:rFonts w:ascii="Microsoft YaHei" w:hAnsi="Microsoft YaHei" w:eastAsia="Microsoft YaHei"/>
-          <w:sz w:val="20"/>
-        </w:rPr>
-        <w:t>PPT 上指：`seed=42`、`120 users`、`3365 triples`、`5209/14600`。</w:t>
+        <w:t>我们这套系统的主线，是把校园社交里的自然语言、兴趣、价值观、时间地点和安全反馈，变成可检索、可解释、可治理的知识系统。用户端看到的是心动星球和闪电搭子，管理员端看到的是证据链。后台总览能直接看到当前规模：120 个合成用户、3365 条画像三元组、5209 个 Neo4j 产品图节点和 14600 条关系。技术链路按课上知识组织：先做知识获取和本体建模，再做向量检索和图检索，最后接入 RAG、图学习和治理策略。也就是说，PPT 不是单独讲概念，每个技术点都能在公网后台找到对应画面。</w:t>
+      </w:r>
+    </w:p>
+    <w:p>
+      <w:r>
+        <w:rPr>
+          <w:rFonts w:ascii="Microsoft YaHei" w:hAnsi="Microsoft YaHei" w:eastAsia="Microsoft YaHei"/>
+          <w:sz w:val="20"/>
+        </w:rPr>
+        <w:t>估算：约 192 字，约 48-50 秒。</w:t>
+      </w:r>
+    </w:p>
+    <w:p>
+      <w:r>
+        <w:rPr>
+          <w:rFonts w:ascii="Microsoft YaHei" w:hAnsi="Microsoft YaHei" w:eastAsia="Microsoft YaHei"/>
+          <w:sz w:val="20"/>
+        </w:rPr>
+        <w:t>PPT 上指：`管理员后台 -&gt; 总览`，指用户数、画像三元组、Neo4j 产品图规模。</w:t>
       </w:r>
     </w:p>
     <w:p>
@@ -7025,7 +7034,7 @@
         <w:pStyle w:val="Heading2"/>
       </w:pPr>
       <w:r>
-        <w:t>第 2 页，0:35-1:20，画像抽取和本体</w:t>
+        <w:t>第 2 页，0:40-1:30，画像抽取和本体</w:t>
       </w:r>
     </w:p>
     <w:p>
@@ -7047,16 +7056,25 @@
           <w:i/>
           <w:sz w:val="20"/>
         </w:rPr>
-        <w:t>画像部分对应实体识别、关系抽取和本体建模。合成用户来自固定字段池：`36` 个兴趣、`15` 个价值观、`12` 个雷点、`4` 个校区、`4` 类关系目标。每个用户采样 `4-7` 个兴趣、`3-5` 个价值观、`2-4` 个雷点。系统把用户资料模拟成 `4` 轮访谈，再抽取 `LIKES、VALUES、HAS_GOAL、PREFERS_DATE、DISLIKES` 等关系。API 抽取参数是 `temperature=0.1,max_tokens=1200`；没有 API 时用规则 fallback。本体校验检查 User 只能连到合法实体类型，结果是 `3365/3365` 通过，valid ratio 是 `1.0`。</w:t>
-      </w:r>
-    </w:p>
-    <w:p>
-      <w:r>
-        <w:rPr>
-          <w:rFonts w:ascii="Microsoft YaHei" w:hAnsi="Microsoft YaHei" w:eastAsia="Microsoft YaHei"/>
-          <w:sz w:val="20"/>
-        </w:rPr>
-        <w:t>PPT 上指：访谈样例、`User-LIKES-Interest`、`valid_ratio=1.0`。</w:t>
+        <w:t>第二页讲知识获取。注册资料本来是自然语言，不能直接用于图查询，所以我们把每个用户模拟成 4 轮访谈，再抽取兴趣、价值观、关系目标、沟通方式、约会偏好和雷点。抽取结果不是散乱标签，而是受控三元组，例如用户通过 LIKES 连接兴趣，通过 VALUES 连接价值观，通过 DISLIKES 连接雷点。这里对应课上的实体识别、关系抽取和本体约束。本体校验的作用是防止关系乱连，比如价值观不能被写成地点，雷点不能被写成兴趣。API 抽取只是证明大模型可以接入；没有 API 时，规则 fallback 仍然产出同样结构。后台能看到访谈、三元组和 3365/3365 的校验结果。</w:t>
+      </w:r>
+    </w:p>
+    <w:p>
+      <w:r>
+        <w:rPr>
+          <w:rFonts w:ascii="Microsoft YaHei" w:hAnsi="Microsoft YaHei" w:eastAsia="Microsoft YaHei"/>
+          <w:sz w:val="20"/>
+        </w:rPr>
+        <w:t>估算：约 211 字，约 51-55 秒。</w:t>
+      </w:r>
+    </w:p>
+    <w:p>
+      <w:r>
+        <w:rPr>
+          <w:rFonts w:ascii="Microsoft YaHei" w:hAnsi="Microsoft YaHei" w:eastAsia="Microsoft YaHei"/>
+          <w:sz w:val="20"/>
+        </w:rPr>
+        <w:t>PPT 上指：`管理员后台 -&gt; 访谈抽取`，截“4 轮访谈 -&gt; 三元组样例”和“本体约束与图谱质量”。</w:t>
       </w:r>
     </w:p>
     <w:p>
@@ -7064,7 +7082,7 @@
         <w:pStyle w:val="Heading2"/>
       </w:pPr>
       <w:r>
-        <w:t>第 3 页，1:20-2:30，Text-to-Graph 和混合检索</w:t>
+        <w:t>第 3 页，1:30-2:35，Text-to-Graph 和混合检索</w:t>
       </w:r>
     </w:p>
     <w:p>
@@ -7086,16 +7104,25 @@
           <w:i/>
           <w:sz w:val="20"/>
         </w:rPr>
-        <w:t>搜索先做 Text-to-Graph。以“想找会弹吉他的阳光学长”为例，显性需求是“会弹吉他、偏好男生”，隐性意图扩展成“音乐技能、艺术细胞、外向主动”，再映射到画像字段：古典音乐、Livehouse、音乐节、male。然后进入混合检索：BM25 负责稀疏词命中，参数 `k1=1.5,b=0.75`；Dense 部分用 `paraphrase-multilingual-MiniLM-L12-v2`，12 层、12 heads、hidden size `384`，输出 `120 x 384` 向量。融合权重是 BM25 `0.30`、Dense `0.32`、Graph `0.26`、Constraint `0.12`。FAISS 对比里，Flat 平均 `0.01097 ms`；IVF 是 `nlist=8,nprobe=2`，重合率 `0.4`；HNSW 是 `M=16,efSearch=32`，平均 `0.01549 ms`，与 Flat Top-K 重合率 `0.9333`。</w:t>
-      </w:r>
-    </w:p>
-    <w:p>
-      <w:r>
-        <w:rPr>
-          <w:rFonts w:ascii="Microsoft YaHei" w:hAnsi="Microsoft YaHei" w:eastAsia="Microsoft YaHei"/>
-          <w:sz w:val="20"/>
-        </w:rPr>
-        <w:t>PPT 上指：Text-to-Graph 四层、融合权重、FAISS 对比表。</w:t>
+        <w:t>第三页讲检索。普通筛选只能匹配显性词，但用户经常说的是口语需求，比如“想找会弹吉他的阳光学长”。系统先做 Text-to-Graph，把这句话拆成显性需求、隐性意图、画像字段和硬条件。显性需求保证可解释，隐性意图负责扩展召回，例如从“吉他”扩展到音乐技能、艺术细胞和 Livehouse。检索阶段不是单路向量，而是 BM25、Dense 向量、Graph 约束和 Constraint 四路融合。MiniLM 输出 384 维文本向量；BM25 负责精确词；图约束负责多跳语义扩展；硬条件保证性别、时间、地点不被相似度淹没。FAISS 部分展示 Flat、IVF、HNSW 三种索引对比，分别对应精确检索、倒排聚类和近似最近邻图。由于数据量小，我们不夸速度收益，只说明索引结构和召回差异。这里和课上向量数据库、稀疏检索、ANN 检索是对应的。</w:t>
+      </w:r>
+    </w:p>
+    <w:p>
+      <w:r>
+        <w:rPr>
+          <w:rFonts w:ascii="Microsoft YaHei" w:hAnsi="Microsoft YaHei" w:eastAsia="Microsoft YaHei"/>
+          <w:sz w:val="20"/>
+        </w:rPr>
+        <w:t>估算：约 255 字，约 61-67 秒。</w:t>
+      </w:r>
+    </w:p>
+    <w:p>
+      <w:r>
+        <w:rPr>
+          <w:rFonts w:ascii="Microsoft YaHei" w:hAnsi="Microsoft YaHei" w:eastAsia="Microsoft YaHei"/>
+          <w:sz w:val="20"/>
+        </w:rPr>
+        <w:t>PPT 上指：`管理员后台 -&gt; 技术证据`，截“意图图谱样例”“BM25 + 向量 + 图约束”“FAISS ANN 索引对比”。</w:t>
       </w:r>
     </w:p>
     <w:p>
@@ -7103,7 +7130,7 @@
         <w:pStyle w:val="Heading2"/>
       </w:pPr>
       <w:r>
-        <w:t>第 4 页，2:30-3:10，Neo4j 和 GraphRAG</w:t>
+        <w:t>第 4 页，2:35-3:25，Neo4j 和 GraphRAG</w:t>
       </w:r>
     </w:p>
     <w:p>
@@ -7125,16 +7152,25 @@
           <w:i/>
           <w:sz w:val="20"/>
         </w:rPr>
-        <w:t>Neo4j 不是只导画像图，而是产品运行图。节点包括 `User=120`、`MatchRecommendation=600`、`GraphRAGEvidence=3599`、`SceneCandidateRank=60`、`ChatDay=56`、`GovernanceRecord=120`。GraphRAG 的做法是先查受限关系的共同邻居，不是把资料全塞进 prompt。比如 U001 和 U010，系统查 `LIKES、VALUES、PREFERS_DATE、HAS_GOAL、AVAILABLE_AT` 的两跳路径，得到 `U001-[LIKES]-&gt;剧本杀&lt;-[LIKES]-U010`，以及边界感、安全感、图书馆学习等路径，再把这些路径生成推荐理由和破冰话题。</w:t>
-      </w:r>
-    </w:p>
-    <w:p>
-      <w:r>
-        <w:rPr>
-          <w:rFonts w:ascii="Microsoft YaHei" w:hAnsi="Microsoft YaHei" w:eastAsia="Microsoft YaHei"/>
-          <w:sz w:val="20"/>
-        </w:rPr>
-        <w:t>PPT 上指：Neo4j 规模、两跳路径、GraphRAG evidence。</w:t>
+        <w:t>第四页讲图数据库和 GraphRAG。我们没有只画一个兴趣图，而是把产品运行过程也入图：用户、推荐、GraphRAG 证据、闪电搭子任务、聊天热度、首约安全和信用治理都在同一张产品图里。GraphRAG 的核心不是把资料全塞进 prompt，而是先做子图检索和多跳路径查询。比如 U001 和 U010，系统先查共同邻居，找到共同兴趣“剧本杀”、共同价值观“边界感”和共同约会偏好，再把这些路径作为推荐理由和破冰话题。可解释性来自图路径，而不是模型临场编出来。后台图谱节点可以拖拽，也可以点开字段；老师追问某条推荐为什么成立时，就沿着节点详情和相连关系讲。这里展示的是图数据库结构和路径证据，不是装饰图。</w:t>
+      </w:r>
+    </w:p>
+    <w:p>
+      <w:r>
+        <w:rPr>
+          <w:rFonts w:ascii="Microsoft YaHei" w:hAnsi="Microsoft YaHei" w:eastAsia="Microsoft YaHei"/>
+          <w:sz w:val="20"/>
+        </w:rPr>
+        <w:t>估算：约 235 字，约 56-61 秒。</w:t>
+      </w:r>
+    </w:p>
+    <w:p>
+      <w:r>
+        <w:rPr>
+          <w:rFonts w:ascii="Microsoft YaHei" w:hAnsi="Microsoft YaHei" w:eastAsia="Microsoft YaHei"/>
+          <w:sz w:val="20"/>
+        </w:rPr>
+        <w:t>PPT 上指：`管理员后台 -&gt; Neo4j图谱`，点击节点后截“产品图可视化”和节点详情。</w:t>
       </w:r>
     </w:p>
     <w:p>
@@ -7142,7 +7178,7 @@
         <w:pStyle w:val="Heading2"/>
       </w:pPr>
       <w:r>
-        <w:t>第 5 页，3:10-4:55，匹配公式、GraphSAGE、GCN</w:t>
+        <w:t>第 5 页，3:25-4:55，匹配公式、GraphSAGE、GCN</w:t>
       </w:r>
     </w:p>
     <w:p>
@@ -7164,7 +7200,42 @@
           <w:i/>
           <w:sz w:val="20"/>
         </w:rPr>
-        <w:t>推荐分数是明确公式：文本相似 `0.27`、图谱相似 `0.22`、价值观 `0.18`、目标一致 `0.10`、沟通一致 `0.05`、图片 `0.08`、GNN link score `0.10`，再减 penalty。图谱相似又拆成兴趣 Jaccard `0.45`、价值观 `0.35`、约会偏好 `0.10`、空闲时间 `0.10`。惩罚项包括目标冲突 `0.30`、雷点命中 `0.40`、校区不同 `0.05`、沟通冲突 `0.12`。</w:t>
+        <w:t>第五页讲排序和图学习。最终匹配不是一个单独相似度，而是多路加权：文本语义、图谱相似、价值观、关系目标、沟通方式、图片辅助和 GNN link score 共同决定分数。图谱相似又拆成兴趣、价值观、约会偏好和空闲时间的 Jaccard，所以每一项都能解释。GraphSAGE 做的是链接预测，对应课上的图表示学习：用户节点用 384 维文本向量，属性节点用 hash embedding，两层 mean aggregation 学习邻居信息，预测两个用户是否可能形成匹配边。因为没有真实恋爱成功标签，这里用共同兴趣、共同价值观和目标一致构造伪标签，所以汇报时只说课程方法验证。GCN 做风险节点分类，把信用事件和图邻域一起传播，输出风险概率，辅助后台降权、冷却和复核。两者分工不同：GraphSAGE 解决“谁可能匹配”，GCN 解决“谁需要治理”。后台同时展示 gnn_link_score、risk probability 和 AUC，所以模型没有停留在概念层。</w:t>
+      </w:r>
+    </w:p>
+    <w:p>
+      <w:r>
+        <w:rPr>
+          <w:rFonts w:ascii="Microsoft YaHei" w:hAnsi="Microsoft YaHei" w:eastAsia="Microsoft YaHei"/>
+          <w:sz w:val="20"/>
+        </w:rPr>
+        <w:t>估算：约 285 字，约 68-74 秒。</w:t>
+      </w:r>
+    </w:p>
+    <w:p>
+      <w:r>
+        <w:rPr>
+          <w:rFonts w:ascii="Microsoft YaHei" w:hAnsi="Microsoft YaHei" w:eastAsia="Microsoft YaHei"/>
+          <w:sz w:val="20"/>
+        </w:rPr>
+        <w:t>PPT 上指：`管理员后台 -&gt; 技术证据`，截“GNN 链接预测样例”和“GCN 风险节点分类”；需要分数拆解时补 `匹配推荐`。</w:t>
+      </w:r>
+    </w:p>
+    <w:p>
+      <w:pPr>
+        <w:pStyle w:val="Heading2"/>
+      </w:pPr>
+      <w:r>
+        <w:t>第 6 页，4:55-6:00，聊天 RAG</w:t>
+      </w:r>
+    </w:p>
+    <w:p>
+      <w:r>
+        <w:rPr>
+          <w:rFonts w:ascii="Microsoft YaHei" w:hAnsi="Microsoft YaHei" w:eastAsia="Microsoft YaHei"/>
+          <w:sz w:val="20"/>
+        </w:rPr>
+        <w:t>口播：</w:t>
       </w:r>
     </w:p>
     <w:p>
@@ -7177,6 +7248,42 @@
           <w:i/>
           <w:sz w:val="20"/>
         </w:rPr>
+        <w:t>第六页讲 RAG。聊天回复不能只靠模板，也不能直接把所有资料丢给大模型。系统先做 query rewrite 和 router，判断这是破冰、活动推荐、情绪照顾还是首约安全；再从画像、匹配理由、破冰库和安全库里取 Top-K 证据，压缩后再生成回复，最后做 safety verifier。这样做的结果是，像“剧本杀有没有活动推荐”这种问题，会先命中“不要编造活动名”的证据，再引导用户确认偏好，而不是反复抛同一句硬核推理问题。这里对应课上的 RAG、证据压缩和生成约束。公网后台展示的是完整 trace：用户问题、命中文档、最终回复和安全校验都能看到，所以这页的重点是“先检索证据，再生成回答”。即使公网不能暴露 API key，同学也能用 trace 截图证明链路跑通过。</w:t>
+      </w:r>
+    </w:p>
+    <w:p>
+      <w:r>
+        <w:rPr>
+          <w:rFonts w:ascii="Microsoft YaHei" w:hAnsi="Microsoft YaHei" w:eastAsia="Microsoft YaHei"/>
+          <w:sz w:val="20"/>
+        </w:rPr>
+        <w:t>估算：约 243 字，约 58-63 秒。</w:t>
+      </w:r>
+    </w:p>
+    <w:p>
+      <w:r>
+        <w:rPr>
+          <w:rFonts w:ascii="Microsoft YaHei" w:hAnsi="Microsoft YaHei" w:eastAsia="Microsoft YaHei"/>
+          <w:sz w:val="20"/>
+        </w:rPr>
+        <w:t>PPT 上指：`管理员后台 -&gt; API Trace` 和 `技术证据`，截 RAG trace、Top-K evidence、safety verifier。</w:t>
+      </w:r>
+    </w:p>
+    <w:p>
+      <w:pPr>
+        <w:pStyle w:val="Heading2"/>
+      </w:pPr>
+      <w:r>
+        <w:t>第 7 页，6:00-6:50，闪电搭子、热度和治理</w:t>
+      </w:r>
+    </w:p>
+    <w:p>
+      <w:r>
+        <w:rPr>
+          <w:rFonts w:ascii="Microsoft YaHei" w:hAnsi="Microsoft YaHei" w:eastAsia="Microsoft YaHei"/>
+          <w:sz w:val="20"/>
+        </w:rPr>
+        <w:t>口播：</w:t>
       </w:r>
     </w:p>
     <w:p>
@@ -7189,119 +7296,34 @@
           <w:i/>
           <w:sz w:val="20"/>
         </w:rPr>
-        <w:t>GraphSAGE 训练的是用户-用户链接预测。用户节点用 `384` 维 MiniLM 向量，属性节点用 hash embedding，伪标签规则是：共同兴趣至少 `2` 个、共同价值观至少 `1` 个、关系目标一致。模型是两层 mean GraphSAGE，decoder 是两端 embedding 点积，loss 是 BCE logits。训练 `80` epoch，hidden dim `128`，AdamW `lr=1e-3`，test AUC `0.7039`，输出 `7140` 个 pair score，并以 `0.10` 权重进排序。</w:t>
-      </w:r>
-    </w:p>
-    <w:p>
-      <w:pPr>
-        <w:pStyle w:val="IntenseQuote"/>
-      </w:pPr>
-      <w:r>
-        <w:rPr>
-          <w:rFonts w:ascii="Microsoft YaHei" w:hAnsi="Microsoft YaHei" w:eastAsia="Microsoft YaHei"/>
-          <w:i/>
-          <w:sz w:val="20"/>
-        </w:rPr>
-      </w:r>
-    </w:p>
-    <w:p>
-      <w:pPr>
-        <w:pStyle w:val="IntenseQuote"/>
-      </w:pPr>
-      <w:r>
-        <w:rPr>
-          <w:rFonts w:ascii="Microsoft YaHei" w:hAnsi="Microsoft YaHei" w:eastAsia="Microsoft YaHei"/>
-          <w:i/>
-          <w:sz w:val="20"/>
-        </w:rPr>
-        <w:t>GCN 训练的是风险节点分类。风险标签来自信用分和治理规则，模型用两层 GCN，邻接矩阵做 `D^-1/2 A D^-1/2` 归一化。训练 `80` epoch，hidden dim `96`，test AUC `0.9825`，accuracy `0.88`。</w:t>
-      </w:r>
-    </w:p>
-    <w:p>
-      <w:r>
-        <w:rPr>
-          <w:rFonts w:ascii="Microsoft YaHei" w:hAnsi="Microsoft YaHei" w:eastAsia="Microsoft YaHei"/>
-          <w:sz w:val="20"/>
-        </w:rPr>
-        <w:t>PPT 上指：匹配公式、GraphSAGE AUC、GCN AUC。</w:t>
-      </w:r>
-    </w:p>
-    <w:p>
-      <w:pPr>
-        <w:pStyle w:val="Heading2"/>
-      </w:pPr>
-      <w:r>
-        <w:t>第 6 页，4:55-5:55，聊天 RAG</w:t>
-      </w:r>
-    </w:p>
-    <w:p>
-      <w:r>
-        <w:rPr>
-          <w:rFonts w:ascii="Microsoft YaHei" w:hAnsi="Microsoft YaHei" w:eastAsia="Microsoft YaHei"/>
-          <w:sz w:val="20"/>
-        </w:rPr>
-        <w:t>口播：</w:t>
-      </w:r>
-    </w:p>
-    <w:p>
-      <w:pPr>
-        <w:pStyle w:val="IntenseQuote"/>
-      </w:pPr>
-      <w:r>
-        <w:rPr>
-          <w:rFonts w:ascii="Microsoft YaHei" w:hAnsi="Microsoft YaHei" w:eastAsia="Microsoft YaHei"/>
-          <w:i/>
-          <w:sz w:val="20"/>
-        </w:rPr>
-        <w:t>聊天不是模板，也不是直接问大模型。流程是 `query rewrite -&gt; router -&gt; retrieval -&gt; rerank -&gt; context compression -&gt; generation -&gt; safety verifier`。知识库有 `11` 类文档，包括破冰、活动防编造、首约安全、情绪照顾和见后反馈。检索用 `384` 维短文本 hash embedding，加入中文 unigram、bigram、trigram；Top-K 取 `3`。规则加分也写死在 trace 里：剧本杀活动推荐命中防编造文档加 `0.28`，情绪低落命中照顾文档加 `0.24`，首约安全加 `0.18`。RAG API 参数是 `temperature=0.4,max_tokens=220`，当前 `12` 条 trace 中 `10` 条 API 生成成功。</w:t>
-      </w:r>
-    </w:p>
-    <w:p>
-      <w:r>
-        <w:rPr>
-          <w:rFonts w:ascii="Microsoft YaHei" w:hAnsi="Microsoft YaHei" w:eastAsia="Microsoft YaHei"/>
-          <w:sz w:val="20"/>
-        </w:rPr>
-        <w:t>PPT 上指：RAG steps、Top-3 evidence、safety verifier。</w:t>
-      </w:r>
-    </w:p>
-    <w:p>
-      <w:pPr>
-        <w:pStyle w:val="Heading2"/>
-      </w:pPr>
-      <w:r>
-        <w:t>第 7 页，5:55-6:40，闪电搭子、热度和治理</w:t>
-      </w:r>
-    </w:p>
-    <w:p>
-      <w:r>
-        <w:rPr>
-          <w:rFonts w:ascii="Microsoft YaHei" w:hAnsi="Microsoft YaHei" w:eastAsia="Microsoft YaHei"/>
-          <w:sz w:val="20"/>
-        </w:rPr>
-        <w:t>口播：</w:t>
-      </w:r>
-    </w:p>
-    <w:p>
-      <w:pPr>
-        <w:pStyle w:val="IntenseQuote"/>
-      </w:pPr>
-      <w:r>
-        <w:rPr>
-          <w:rFonts w:ascii="Microsoft YaHei" w:hAnsi="Microsoft YaHei" w:eastAsia="Microsoft YaHei"/>
-          <w:i/>
-          <w:sz w:val="20"/>
-        </w:rPr>
-        <w:t>闪电搭子用单独的场景排序，不套恋爱匹配公式。意图识别把吃饭归为 `meal`，刷题归为 `study`，羽毛球归为 `sports`，Citywalk 归为 `walk`。场景公式是 `0.28*semantic + 0.22*time + 0.20*location + 0.20*task + 0.10*care - safety_penalty`，高风险地点 penalty 是 `0.15`，当前有 `12` 个 scene request 和 `60` 个 scene match。热度公式用 message_count、positive_ratio、shared_topic_hits 和回复延迟计算。信用分公式是 `100 - 18*no_show - 8*late_cancel - 20*unsafe_report - 40*harassment + 3*positive_feedback`；低于 `85/70/50` 分别降到 `0.85/0.60/0.30` 可见度，爽约两次进入 `12` 小时冷却。</w:t>
-      </w:r>
-    </w:p>
-    <w:p>
-      <w:r>
-        <w:rPr>
-          <w:rFonts w:ascii="Microsoft YaHei" w:hAnsi="Microsoft YaHei" w:eastAsia="Microsoft YaHei"/>
-          <w:sz w:val="20"/>
-        </w:rPr>
-        <w:t>PPT 上指：场景公式、热度公式、信用分阈值。</w:t>
+        <w:t>最后一页讲动态知识更新。心动星球偏长期关系，闪电搭子偏即时任务，所以闪电搭子单独按任务、时间、地点、活动类型、照顾信号和安全地点排序。关系热度不是用户一进来就看到 7 天结果，而是后台演示用的历史聚合指标，由消息数、回复延迟、积极比例和共同话题计算。治理侧把爽约、不安全反馈、骚扰标记和正反馈转成信用分，再影响推荐可见度、发布冷却和人工复核。这里对应课上的动态知识管理和知识治理。用户端只看到自己的提醒和建议，管理员端看到聚合指标和策略原因。收束到产品逻辑上，就是系统不只做一次推荐，而是让图谱、检索、排序和治理随着交互持续更新。</w:t>
+      </w:r>
+    </w:p>
+    <w:p>
+      <w:r>
+        <w:rPr>
+          <w:rFonts w:ascii="Microsoft YaHei" w:hAnsi="Microsoft YaHei" w:eastAsia="Microsoft YaHei"/>
+          <w:sz w:val="20"/>
+        </w:rPr>
+        <w:t>估算：约 237 字，约 57-62 秒。</w:t>
+      </w:r>
+    </w:p>
+    <w:p>
+      <w:r>
+        <w:rPr>
+          <w:rFonts w:ascii="Microsoft YaHei" w:hAnsi="Microsoft YaHei" w:eastAsia="Microsoft YaHei"/>
+          <w:sz w:val="20"/>
+        </w:rPr>
+        <w:t>PPT 上指：`管理员后台 -&gt; 搭子任务` 和 `关系安全`，截候选排序、热度、安全和信用治理。</w:t>
+      </w:r>
+    </w:p>
+    <w:p>
+      <w:r>
+        <w:rPr>
+          <w:rFonts w:ascii="Microsoft YaHei" w:hAnsi="Microsoft YaHei" w:eastAsia="Microsoft YaHei"/>
+          <w:sz w:val="20"/>
+        </w:rPr>
+        <w:t>总估算：正文约 1658 个口播单位，按 230-250 字/分钟约 6分38秒-7分13秒。实际汇报时正常停顿和换页后基本落在 7 分钟左右。</w:t>
       </w:r>
     </w:p>
     <w:p>

</xml_diff>